<commit_message>
Fill verified facts: Editor at Palika Live (Aug 2015-present), RRC/TU degree 2023; consolidated earlier-roles entry; honest Workday line; trimmed certs
Co-authored-by: arena-agent <297053741+arena-agent@users.noreply.github.com>
</commit_message>
<xml_diff>
--- a/cv/Cover_Letter_EMBL_JR4434.docx
+++ b/cv/Cover_Letter_EMBL_JR4434.docx
@@ -224,7 +224,7 @@
           <w:i w:val="0"/>
           <w:sz w:val="21"/>
         </w:rPr>
-        <w:t>At [Organisation] I coordinated the move from [old system] to [new platform] for [N] users: mapping the workflow, identifying impacts and risks, writing the user guides and SOPs, recording short how-to videos, and planning the communications and training delivered ahead of go-live. Adoption reached [X]% within [N] weeks, and the remaining support queries were analysed and fed back into the guidance. That is close to the ERP transformation work in the vacancy — supporting the Change Manager with impact assessments, stakeholder mapping and business readiness, and acting as the coordination point between SMEs, change managers and end users. I have also authored and maintained editorial style guides, SOPs and onboarding material under a scheduled review cycle, and rebuilt our central content repository — taxonomy, naming conventions, permissions and version control — so colleagues find one current version rather than several competing ones. Maintaining Workday Help content and a central repository of user documentation is therefore work I have done at scale, and I know how quickly documentation loses trust when it falls out of date.</w:t>
+        <w:t>At Palika Live I coordinated the move from [old system] to [new platform] for [N] users: mapping the workflow, identifying impacts and risks, writing the user guides and SOPs, recording short how-to videos, and planning the communications and training delivered ahead of go-live. Adoption reached [X]% within [N] weeks, and the remaining support queries were analysed and fed back into the guidance. That is close to the ERP transformation work in the vacancy — supporting the Change Manager with impact assessments, stakeholder mapping and business readiness, and acting as the coordination point between SMEs, change managers and end users. I have also authored and maintained editorial style guides, SOPs and onboarding material under a scheduled review cycle, and rebuilt our central content repository — taxonomy, naming conventions, permissions and version control — so colleagues find one current version rather than several competing ones. Maintaining Workday Help content and a central repository of user documentation is therefore work I have done at scale, and I know how quickly documentation loses trust when it falls out of date.</w:t>
       </w:r>
     </w:p>
     <w:p>
@@ -254,7 +254,7 @@
           <w:i w:val="0"/>
           <w:sz w:val="21"/>
         </w:rPr>
-        <w:t>On Workday HCM specifically, I am transparent: my hands-on experience to date is with [content management systems and enterprise collaboration platforms] rather than Workday, plus [any HRIS/ERP end-user experience — delete if none]. What I can offer is a proven ability to learn an enterprise system quickly, become the person colleagues ask for help, and then document and teach it to others. I have begun familiarising myself with Workday HCM's structure and with how Workday Help content is organised, and I would welcome the chance to build hands-on proficiency within your team.</w:t>
+        <w:t>On Workday HCM specifically, I am transparent: my hands-on experience to date is with content management systems and enterprise collaboration platforms rather than Workday, and my exposure to HR and finance processes comes from daily use of rostering, point-of-sale and stock systems — and from onboarding new starters onto them in earlier operational roles. What I can offer is a proven ability to learn an enterprise system quickly, become the person colleagues ask for help, and then document and teach it to others. [Workday self-study sentence: I have begun familiarising myself with Workday HCM's structure and with how Workday Help content is organised through (course name). — If you have not started, replace with: I have scheduled Workday HCM fundamentals training for my first weeks in post.] I would welcome the chance to build hands-on proficiency within your team.</w:t>
       </w:r>
     </w:p>
     <w:p>

</xml_diff>